<commit_message>
Generation V2: complete template integration and QA
</commit_message>
<xml_diff>
--- a/templates/Addendum.docx
+++ b/templates/Addendum.docx
@@ -1,8 +1,8 @@
 
 <file path=word/document.xml><?xml version="1.0" encoding="utf-8"?>
-<w:document xmlns:a="http://schemas.openxmlformats.org/drawingml/2006/main" xmlns:mc="http://schemas.openxmlformats.org/markup-compatibility/2006" xmlns:ns6="http://schemas.microsoft.com/office/word/2010/wordprocessingShape" xmlns:ns9="urn:schemas-microsoft-com:office:word" xmlns:o="urn:schemas-microsoft-com:office:office" xmlns:v="urn:schemas-microsoft-com:vml" xmlns:w="http://schemas.openxmlformats.org/wordprocessingml/2006/main" xmlns:w14="http://schemas.microsoft.com/office/word/2010/wordml" xmlns:wp="http://schemas.openxmlformats.org/drawingml/2006/wordprocessingDrawing" xmlns:wp14="http://schemas.microsoft.com/office/word/2010/wordprocessingDrawing" mc:Ignorable="w14 w15 w16se w16cid w16 w16cex w16sdtdh w16sdtfl w16du wp14">
+<w:document xmlns:ns1="http://schemas.openxmlformats.org/markup-compatibility/2006" xmlns:ns2="http://schemas.microsoft.com/office/word/2010/wordml" xmlns:ns3="http://schemas.openxmlformats.org/drawingml/2006/wordprocessingDrawing" xmlns:ns4="http://schemas.microsoft.com/office/word/2010/wordprocessingDrawing" xmlns:ns5="http://schemas.openxmlformats.org/drawingml/2006/main" xmlns:ns6="http://schemas.microsoft.com/office/word/2010/wordprocessingShape" xmlns:ns7="urn:schemas-microsoft-com:vml" xmlns:ns8="urn:schemas-microsoft-com:office:office" xmlns:ns9="urn:schemas-microsoft-com:office:word" xmlns:w="http://schemas.openxmlformats.org/wordprocessingml/2006/main" ns1:Ignorable="w14 w15 w16se w16cid w16 w16cex w16sdtdh w16sdtfl w16du wp14">
   <w:body>
-    <w:p>
+    <w:p ns2:paraId="79134574" ns2:textId="77777777">
       <w:pPr>
         <w:pStyle w:val="Heading1"/>
       </w:pPr>
@@ -40,7 +40,7 @@
         <w:t>AGREEMENT</w:t>
       </w:r>
     </w:p>
-    <w:p>
+    <w:p ns2:paraId="735C7D88" ns2:textId="618673B1">
       <w:pPr>
         <w:pStyle w:val="Heading3"/>
         <w:spacing w:before="236"/>
@@ -167,7 +167,7 @@
         <w:t>between:</w:t>
       </w:r>
     </w:p>
-    <w:p>
+    <w:p ns2:paraId="3E48B721" ns2:textId="77777777">
       <w:pPr>
         <w:pStyle w:val="BodyText"/>
         <w:spacing w:before="230"/>
@@ -176,7 +176,7 @@
         </w:rPr>
       </w:pPr>
     </w:p>
-    <w:p>
+    <w:p ns2:paraId="06A6360C" ns2:textId="7159DDF3">
       <w:pPr>
         <w:tabs>
           <w:tab w:val="left" w:pos="2568"/>
@@ -214,7 +214,7 @@
         <w:t>{{SELLER_NAME}}</w:t>
       </w:r>
     </w:p>
-    <w:p>
+    <w:p ns2:paraId="317421A8" ns2:textId="77777777">
       <w:pPr>
         <w:pStyle w:val="BodyText"/>
         <w:spacing w:before="5"/>
@@ -231,91 +231,91 @@
           <w:noProof/>
           <w:sz w:val="20"/>
         </w:rPr>
-        <mc:AlternateContent>
-          <mc:Choice Requires="wps">
+        <ns1:AlternateContent>
+          <ns1:Choice Requires="wps">
             <w:drawing>
-              <wp:anchor distT="0" distB="0" distL="0" distR="0" simplePos="0" relativeHeight="487587840" behindDoc="1" locked="0" layoutInCell="1" allowOverlap="1" wp14:anchorId="0F719455" wp14:editId="135438DA">
-                <wp:simplePos x="0" y="0"/>
-                <wp:positionH relativeFrom="page">
-                  <wp:posOffset>1479550</wp:posOffset>
-                </wp:positionH>
-                <wp:positionV relativeFrom="paragraph">
-                  <wp:posOffset>167706</wp:posOffset>
-                </wp:positionV>
-                <wp:extent cx="2964180" cy="1270"/>
-                <wp:effectExtent l="0" t="0" r="0" b="0"/>
-                <wp:wrapTopAndBottom/>
-                <wp:docPr id="1" name="Graphic 1"/>
-                <wp:cNvGraphicFramePr>
-                  <a:graphicFrameLocks/>
-                </wp:cNvGraphicFramePr>
-                <a:graphic>
-                  <a:graphicData uri="http://schemas.microsoft.com/office/word/2010/wordprocessingShape">
+              <ns3:anchor distT="0" distB="0" distL="0" distR="0" simplePos="0" relativeHeight="487587840" behindDoc="1" locked="0" layoutInCell="1" allowOverlap="1" ns4:anchorId="0F719455" ns4:editId="135438DA">
+                <ns3:simplePos x="0" y="0"/>
+                <ns3:positionH relativeFrom="page">
+                  <ns3:posOffset>1479550</ns3:posOffset>
+                </ns3:positionH>
+                <ns3:positionV relativeFrom="paragraph">
+                  <ns3:posOffset>167706</ns3:posOffset>
+                </ns3:positionV>
+                <ns3:extent cx="2964180" cy="1270"/>
+                <ns3:effectExtent l="0" t="0" r="0" b="0"/>
+                <ns3:wrapTopAndBottom/>
+                <ns3:docPr id="1" name="Graphic 1"/>
+                <ns3:cNvGraphicFramePr>
+                  <ns5:graphicFrameLocks/>
+                </ns3:cNvGraphicFramePr>
+                <ns5:graphic>
+                  <ns5:graphicData uri="http://schemas.microsoft.com/office/word/2010/wordprocessingShape">
                     <ns6:wsp>
                       <ns6:cNvSpPr>
-                        <a:spLocks/>
+                        <ns5:spLocks/>
                       </ns6:cNvSpPr>
                       <ns6:spPr>
-                        <a:xfrm>
-                          <a:off x="0" y="0"/>
-                          <a:ext cx="2964180" cy="1270"/>
-                        </a:xfrm>
-                        <a:custGeom>
-                          <a:avLst/>
-                          <a:gdLst/>
-                          <a:ahLst/>
-                          <a:cxnLst/>
-                          <a:rect l="l" t="t" r="r" b="b"/>
-                          <a:pathLst>
-                            <a:path w="2964180">
-                              <a:moveTo>
-                                <a:pt x="0" y="0"/>
-                              </a:moveTo>
-                              <a:lnTo>
-                                <a:pt x="1269501" y="0"/>
-                              </a:lnTo>
-                            </a:path>
-                            <a:path w="2964180">
-                              <a:moveTo>
-                                <a:pt x="1271405" y="0"/>
-                              </a:moveTo>
-                              <a:lnTo>
-                                <a:pt x="2964074" y="0"/>
-                              </a:lnTo>
-                            </a:path>
-                          </a:pathLst>
-                        </a:custGeom>
-                        <a:ln w="6186">
-                          <a:solidFill>
-                            <a:srgbClr val="000000"/>
-                          </a:solidFill>
-                          <a:prstDash val="solid"/>
-                        </a:ln>
+                        <ns5:xfrm>
+                          <ns5:off x="0" y="0"/>
+                          <ns5:ext cx="2964180" cy="1270"/>
+                        </ns5:xfrm>
+                        <ns5:custGeom>
+                          <ns5:avLst/>
+                          <ns5:gdLst/>
+                          <ns5:ahLst/>
+                          <ns5:cxnLst/>
+                          <ns5:rect l="l" t="t" r="r" b="b"/>
+                          <ns5:pathLst>
+                            <ns5:path w="2964180">
+                              <ns5:moveTo>
+                                <ns5:pt x="0" y="0"/>
+                              </ns5:moveTo>
+                              <ns5:lnTo>
+                                <ns5:pt x="1269501" y="0"/>
+                              </ns5:lnTo>
+                            </ns5:path>
+                            <ns5:path w="2964180">
+                              <ns5:moveTo>
+                                <ns5:pt x="1271405" y="0"/>
+                              </ns5:moveTo>
+                              <ns5:lnTo>
+                                <ns5:pt x="2964074" y="0"/>
+                              </ns5:lnTo>
+                            </ns5:path>
+                          </ns5:pathLst>
+                        </ns5:custGeom>
+                        <ns5:ln w="6186">
+                          <ns5:solidFill>
+                            <ns5:srgbClr val="000000"/>
+                          </ns5:solidFill>
+                          <ns5:prstDash val="solid"/>
+                        </ns5:ln>
                       </ns6:spPr>
                       <ns6:bodyPr wrap="square" lIns="0" tIns="0" rIns="0" bIns="0" rtlCol="0">
-                        <a:prstTxWarp prst="textNoShape">
-                          <a:avLst/>
-                        </a:prstTxWarp>
-                        <a:noAutofit/>
+                        <ns5:prstTxWarp prst="textNoShape">
+                          <ns5:avLst/>
+                        </ns5:prstTxWarp>
+                        <ns5:noAutofit/>
                       </ns6:bodyPr>
                     </ns6:wsp>
-                  </a:graphicData>
-                </a:graphic>
-              </wp:anchor>
+                  </ns5:graphicData>
+                </ns5:graphic>
+              </ns3:anchor>
             </w:drawing>
-          </mc:Choice>
-          <mc:Fallback>
+          </ns1:Choice>
+          <ns1:Fallback>
             <w:pict>
-              <v:shape w14:anchorId="78FA45A5" id="Graphic 1" o:spid="_x0000_s1026" style="position:absolute;margin-left:116.5pt;margin-top:13.2pt;width:233.4pt;height:.1pt;z-index:-15728640;visibility:visible;mso-wrap-style:square;mso-wrap-distance-left:0;mso-wrap-distance-top:0;mso-wrap-distance-right:0;mso-wrap-distance-bottom:0;mso-position-horizontal:absolute;mso-position-horizontal-relative:page;mso-position-vertical:absolute;mso-position-vertical-relative:text;v-text-anchor:top" coordsize="2964180,1270" o:gfxdata="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" path="m,l1269501,em1271405,l2964074,e" filled="f" strokeweight=".17183mm">
-                <v:path arrowok="t"/>
+              <ns7:shape ns2:anchorId="78FA45A5" id="Graphic 1" ns8:spid="_x0000_s1026" style="position:absolute;margin-left:116.5pt;margin-top:13.2pt;width:233.4pt;height:.1pt;z-index:-15728640;visibility:visible;mso-wrap-style:square;mso-wrap-distance-left:0;mso-wrap-distance-top:0;mso-wrap-distance-right:0;mso-wrap-distance-bottom:0;mso-position-horizontal:absolute;mso-position-horizontal-relative:page;mso-position-vertical:absolute;mso-position-vertical-relative:text;v-text-anchor:top" coordsize="2964180,1270" ns8:gfxdata="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" path="m,l1269501,em1271405,l2964074,e" filled="f" strokeweight=".17183mm">
+                <ns7:path arrowok="t"/>
                 <ns9:wrap type="topAndBottom" anchorx="page"/>
-              </v:shape>
+              </ns7:shape>
             </w:pict>
-          </mc:Fallback>
-        </mc:AlternateContent>
-      </w:r>
-    </w:p>
-    <w:p>
+          </ns1:Fallback>
+        </ns1:AlternateContent>
+      </w:r>
+    </w:p>
+    <w:p ns2:paraId="4F3C05D1" ns2:textId="77777777">
       <w:pPr>
         <w:pStyle w:val="BodyText"/>
         <w:spacing w:before="73"/>
@@ -326,7 +326,7 @@
         </w:rPr>
       </w:pPr>
     </w:p>
-    <w:p>
+    <w:p ns2:paraId="4CB81052" ns2:textId="77777777">
       <w:pPr>
         <w:tabs>
           <w:tab w:val="left" w:pos="2056"/>
@@ -338,93 +338,10 @@
         </w:rPr>
       </w:pPr>
       <w:r>
-        <w:rPr>
-          <w:b/>
-          <w:spacing w:val="-2"/>
-          <w:sz w:val="24"/>
-        </w:rPr>
-        <w:t>Buyer(s):</w:t>
-      </w:r>
-      <w:r>
-        <w:rPr>
-          <w:b/>
-          <w:sz w:val="24"/>
-        </w:rPr>
-        <w:tab/>
-      </w:r>
-      <w:r>
-        <w:rPr>
-          <w:rFonts w:ascii="Arial MT"/>
-          <w:spacing w:val="-4"/>
-          <w:sz w:val="18"/>
-        </w:rPr>
-        <w:t>Same</w:t>
-      </w:r>
-      <w:r>
-        <w:rPr>
-          <w:rFonts w:ascii="Arial MT"/>
-          <w:spacing w:val="-6"/>
-          <w:sz w:val="18"/>
-        </w:rPr>
-        <w:t xml:space="preserve"> </w:t>
-      </w:r>
-      <w:r>
-        <w:rPr>
-          <w:rFonts w:ascii="Arial MT"/>
-          <w:spacing w:val="-4"/>
-          <w:sz w:val="18"/>
-        </w:rPr>
-        <w:t>Day</w:t>
-      </w:r>
-      <w:r>
-        <w:rPr>
-          <w:rFonts w:ascii="Arial MT"/>
-          <w:spacing w:val="-1"/>
-          <w:sz w:val="18"/>
-        </w:rPr>
-        <w:t xml:space="preserve"> </w:t>
-      </w:r>
-      <w:r>
-        <w:rPr>
-          <w:rFonts w:ascii="Arial MT"/>
-          <w:spacing w:val="-4"/>
-          <w:sz w:val="18"/>
-        </w:rPr>
-        <w:t>Home</w:t>
-      </w:r>
-      <w:r>
-        <w:rPr>
-          <w:rFonts w:ascii="Arial MT"/>
-          <w:spacing w:val="-2"/>
-          <w:sz w:val="18"/>
-        </w:rPr>
-        <w:t xml:space="preserve"> </w:t>
-      </w:r>
-      <w:r>
-        <w:rPr>
-          <w:rFonts w:ascii="Arial MT"/>
-          <w:spacing w:val="-4"/>
-          <w:sz w:val="18"/>
-        </w:rPr>
-        <w:t>Solutions</w:t>
-      </w:r>
-      <w:r>
-        <w:rPr>
-          <w:rFonts w:ascii="Arial MT"/>
-          <w:sz w:val="18"/>
-        </w:rPr>
-        <w:t xml:space="preserve"> </w:t>
-      </w:r>
-      <w:r>
-        <w:rPr>
-          <w:rFonts w:ascii="Arial MT"/>
-          <w:spacing w:val="-5"/>
-          <w:sz w:val="18"/>
-        </w:rPr>
-        <w:t>LLC</w:t>
-      </w:r>
-    </w:p>
-    <w:p>
+        <w:t>Buyer(s): {{COMPANY_NAME}}</w:t>
+      </w:r>
+    </w:p>
+    <w:p ns2:paraId="4C56FB1F" ns2:textId="77777777">
       <w:pPr>
         <w:pStyle w:val="BodyText"/>
         <w:spacing w:before="15"/>
@@ -439,91 +356,91 @@
           <w:noProof/>
           <w:sz w:val="20"/>
         </w:rPr>
-        <mc:AlternateContent>
-          <mc:Choice Requires="wps">
+        <ns1:AlternateContent>
+          <ns1:Choice Requires="wps">
             <w:drawing>
-              <wp:anchor distT="0" distB="0" distL="0" distR="0" simplePos="0" relativeHeight="487588352" behindDoc="1" locked="0" layoutInCell="1" allowOverlap="1" wp14:anchorId="2115D0F9" wp14:editId="5CFEA8C3">
-                <wp:simplePos x="0" y="0"/>
-                <wp:positionH relativeFrom="page">
-                  <wp:posOffset>1479550</wp:posOffset>
-                </wp:positionH>
-                <wp:positionV relativeFrom="paragraph">
-                  <wp:posOffset>174098</wp:posOffset>
-                </wp:positionV>
-                <wp:extent cx="2964180" cy="1270"/>
-                <wp:effectExtent l="0" t="0" r="0" b="0"/>
-                <wp:wrapTopAndBottom/>
-                <wp:docPr id="2" name="Graphic 2"/>
-                <wp:cNvGraphicFramePr>
-                  <a:graphicFrameLocks/>
-                </wp:cNvGraphicFramePr>
-                <a:graphic>
-                  <a:graphicData uri="http://schemas.microsoft.com/office/word/2010/wordprocessingShape">
+              <ns3:anchor distT="0" distB="0" distL="0" distR="0" simplePos="0" relativeHeight="487588352" behindDoc="1" locked="0" layoutInCell="1" allowOverlap="1" ns4:anchorId="2115D0F9" ns4:editId="5CFEA8C3">
+                <ns3:simplePos x="0" y="0"/>
+                <ns3:positionH relativeFrom="page">
+                  <ns3:posOffset>1479550</ns3:posOffset>
+                </ns3:positionH>
+                <ns3:positionV relativeFrom="paragraph">
+                  <ns3:posOffset>174098</ns3:posOffset>
+                </ns3:positionV>
+                <ns3:extent cx="2964180" cy="1270"/>
+                <ns3:effectExtent l="0" t="0" r="0" b="0"/>
+                <ns3:wrapTopAndBottom/>
+                <ns3:docPr id="2" name="Graphic 2"/>
+                <ns3:cNvGraphicFramePr>
+                  <ns5:graphicFrameLocks/>
+                </ns3:cNvGraphicFramePr>
+                <ns5:graphic>
+                  <ns5:graphicData uri="http://schemas.microsoft.com/office/word/2010/wordprocessingShape">
                     <ns6:wsp>
                       <ns6:cNvSpPr>
-                        <a:spLocks/>
+                        <ns5:spLocks/>
                       </ns6:cNvSpPr>
                       <ns6:spPr>
-                        <a:xfrm>
-                          <a:off x="0" y="0"/>
-                          <a:ext cx="2964180" cy="1270"/>
-                        </a:xfrm>
-                        <a:custGeom>
-                          <a:avLst/>
-                          <a:gdLst/>
-                          <a:ahLst/>
-                          <a:cxnLst/>
-                          <a:rect l="l" t="t" r="r" b="b"/>
-                          <a:pathLst>
-                            <a:path w="2964180">
-                              <a:moveTo>
-                                <a:pt x="0" y="0"/>
-                              </a:moveTo>
-                              <a:lnTo>
-                                <a:pt x="1269501" y="0"/>
-                              </a:lnTo>
-                            </a:path>
-                            <a:path w="2964180">
-                              <a:moveTo>
-                                <a:pt x="1271405" y="0"/>
-                              </a:moveTo>
-                              <a:lnTo>
-                                <a:pt x="2964074" y="0"/>
-                              </a:lnTo>
-                            </a:path>
-                          </a:pathLst>
-                        </a:custGeom>
-                        <a:ln w="6186">
-                          <a:solidFill>
-                            <a:srgbClr val="000000"/>
-                          </a:solidFill>
-                          <a:prstDash val="solid"/>
-                        </a:ln>
+                        <ns5:xfrm>
+                          <ns5:off x="0" y="0"/>
+                          <ns5:ext cx="2964180" cy="1270"/>
+                        </ns5:xfrm>
+                        <ns5:custGeom>
+                          <ns5:avLst/>
+                          <ns5:gdLst/>
+                          <ns5:ahLst/>
+                          <ns5:cxnLst/>
+                          <ns5:rect l="l" t="t" r="r" b="b"/>
+                          <ns5:pathLst>
+                            <ns5:path w="2964180">
+                              <ns5:moveTo>
+                                <ns5:pt x="0" y="0"/>
+                              </ns5:moveTo>
+                              <ns5:lnTo>
+                                <ns5:pt x="1269501" y="0"/>
+                              </ns5:lnTo>
+                            </ns5:path>
+                            <ns5:path w="2964180">
+                              <ns5:moveTo>
+                                <ns5:pt x="1271405" y="0"/>
+                              </ns5:moveTo>
+                              <ns5:lnTo>
+                                <ns5:pt x="2964074" y="0"/>
+                              </ns5:lnTo>
+                            </ns5:path>
+                          </ns5:pathLst>
+                        </ns5:custGeom>
+                        <ns5:ln w="6186">
+                          <ns5:solidFill>
+                            <ns5:srgbClr val="000000"/>
+                          </ns5:solidFill>
+                          <ns5:prstDash val="solid"/>
+                        </ns5:ln>
                       </ns6:spPr>
                       <ns6:bodyPr wrap="square" lIns="0" tIns="0" rIns="0" bIns="0" rtlCol="0">
-                        <a:prstTxWarp prst="textNoShape">
-                          <a:avLst/>
-                        </a:prstTxWarp>
-                        <a:noAutofit/>
+                        <ns5:prstTxWarp prst="textNoShape">
+                          <ns5:avLst/>
+                        </ns5:prstTxWarp>
+                        <ns5:noAutofit/>
                       </ns6:bodyPr>
                     </ns6:wsp>
-                  </a:graphicData>
-                </a:graphic>
-              </wp:anchor>
+                  </ns5:graphicData>
+                </ns5:graphic>
+              </ns3:anchor>
             </w:drawing>
-          </mc:Choice>
-          <mc:Fallback>
+          </ns1:Choice>
+          <ns1:Fallback>
             <w:pict>
-              <v:shape w14:anchorId="056F00F7" id="Graphic 2" o:spid="_x0000_s1026" style="position:absolute;margin-left:116.5pt;margin-top:13.7pt;width:233.4pt;height:.1pt;z-index:-15728128;visibility:visible;mso-wrap-style:square;mso-wrap-distance-left:0;mso-wrap-distance-top:0;mso-wrap-distance-right:0;mso-wrap-distance-bottom:0;mso-position-horizontal:absolute;mso-position-horizontal-relative:page;mso-position-vertical:absolute;mso-position-vertical-relative:text;v-text-anchor:top" coordsize="2964180,1270" o:gfxdata="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" path="m,l1269501,em1271405,l2964074,e" filled="f" strokeweight=".17183mm">
-                <v:path arrowok="t"/>
+              <ns7:shape ns2:anchorId="056F00F7" id="Graphic 2" ns8:spid="_x0000_s1026" style="position:absolute;margin-left:116.5pt;margin-top:13.7pt;width:233.4pt;height:.1pt;z-index:-15728128;visibility:visible;mso-wrap-style:square;mso-wrap-distance-left:0;mso-wrap-distance-top:0;mso-wrap-distance-right:0;mso-wrap-distance-bottom:0;mso-position-horizontal:absolute;mso-position-horizontal-relative:page;mso-position-vertical:absolute;mso-position-vertical-relative:text;v-text-anchor:top" coordsize="2964180,1270" ns8:gfxdata="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" path="m,l1269501,em1271405,l2964074,e" filled="f" strokeweight=".17183mm">
+                <ns7:path arrowok="t"/>
                 <ns9:wrap type="topAndBottom" anchorx="page"/>
-              </v:shape>
+              </ns7:shape>
             </w:pict>
-          </mc:Fallback>
-        </mc:AlternateContent>
-      </w:r>
-    </w:p>
-    <w:p>
+          </ns1:Fallback>
+        </ns1:AlternateContent>
+      </w:r>
+    </w:p>
+    <w:p ns2:paraId="3FECAC3A" ns2:textId="77777777">
       <w:pPr>
         <w:pStyle w:val="BodyText"/>
         <w:rPr>
@@ -532,7 +449,7 @@
         </w:rPr>
       </w:pPr>
     </w:p>
-    <w:p>
+    <w:p ns2:paraId="75981059" ns2:textId="77777777">
       <w:pPr>
         <w:pStyle w:val="BodyText"/>
         <w:spacing w:before="106"/>
@@ -542,7 +459,7 @@
         </w:rPr>
       </w:pPr>
     </w:p>
-    <w:p>
+    <w:p ns2:paraId="65B81A05" ns2:textId="77777777">
       <w:pPr>
         <w:pStyle w:val="BodyText"/>
         <w:ind w:left="257"/>
@@ -602,7 +519,7 @@
         <w:t>at:</w:t>
       </w:r>
     </w:p>
-    <w:p>
+    <w:p ns2:paraId="62CB1D09" ns2:textId="7612D558">
       <w:pPr>
         <w:pStyle w:val="Heading4"/>
         <w:rPr>
@@ -613,7 +530,7 @@
         <w:t>{{PROPERTY_ADDRESS}}</w:t>
       </w:r>
     </w:p>
-    <w:p>
+    <w:p ns2:paraId="2525DFB4" ns2:textId="77777777">
       <w:pPr>
         <w:pStyle w:val="BodyText"/>
         <w:spacing w:before="2"/>
@@ -622,7 +539,7 @@
         </w:rPr>
       </w:pPr>
     </w:p>
-    <w:p>
+    <w:p ns2:paraId="20C1C1D5" ns2:textId="763A7D03">
       <w:pPr>
         <w:pStyle w:val="BodyText"/>
         <w:spacing w:before="6"/>
@@ -634,7 +551,7 @@
         <w:br/>
       </w:r>
     </w:p>
-    <w:p>
+    <w:p ns2:paraId="4435CF7C" ns2:textId="77777777">
       <w:pPr>
         <w:tabs>
           <w:tab w:val="left" w:pos="720"/>
@@ -780,7 +697,7 @@
         <w:t>force and effect.</w:t>
       </w:r>
     </w:p>
-    <w:p>
+    <w:p ns2:paraId="5F65B058" ns2:textId="77777777">
       <w:pPr>
         <w:pStyle w:val="Heading2"/>
       </w:pPr>
@@ -791,7 +708,7 @@
         <w:t>Signatures:</w:t>
       </w:r>
     </w:p>
-    <w:p>
+    <w:p ns2:paraId="5B2B1A2D" ns2:textId="77777777">
       <w:pPr>
         <w:pStyle w:val="BodyText"/>
         <w:spacing w:before="225"/>
@@ -801,12 +718,12 @@
         </w:rPr>
       </w:pPr>
     </w:p>
-    <w:p>
+    <w:p ns2:paraId="1F981401" ns2:textId="77777777">
       <w:r>
         <w:t>Seller Signature 1: {{SELLER_SIGNATURE_1}} Date:</w:t>
       </w:r>
     </w:p>
-    <w:p>
+    <w:p ns2:paraId="2844342B" ns2:textId="563564C3">
       <w:r>
         <w:rPr>
           <w:rFonts w:ascii="Arial"/>
@@ -817,7 +734,7 @@
         <w:t>{{SELLER_SIGNATURE_2}}</w:t>
       </w:r>
     </w:p>
-    <w:p>
+    <w:p ns2:paraId="11B7F91A" ns2:textId="77777777">
       <w:pPr>
         <w:pStyle w:val="BodyText"/>
         <w:rPr>
@@ -827,7 +744,7 @@
         </w:rPr>
       </w:pPr>
     </w:p>
-    <w:p>
+    <w:p ns2:paraId="0D935046" ns2:textId="77777777">
       <w:pPr>
         <w:pStyle w:val="BodyText"/>
         <w:rPr>
@@ -837,7 +754,7 @@
         </w:rPr>
       </w:pPr>
     </w:p>
-    <w:p>
+    <w:p ns2:paraId="677B4420" ns2:textId="77777777">
       <w:pPr>
         <w:pStyle w:val="BodyText"/>
         <w:spacing w:before="188"/>
@@ -848,7 +765,7 @@
         </w:rPr>
       </w:pPr>
     </w:p>
-    <w:p>
+    <w:p ns2:paraId="7EF17063" ns2:textId="77777777">
       <w:pPr>
         <w:tabs>
           <w:tab w:val="left" w:pos="4380"/>

</xml_diff>